<commit_message>
fix: fix the services-system, treasurer-system to mainly get data from profiling-system in terms of residents and accounts
</commit_message>
<xml_diff>
--- a/services-system/resources/views/certificates/templates/brgy_clearance.docx
+++ b/services-system/resources/views/certificates/templates/brgy_clearance.docx
@@ -1448,6 +1448,8 @@
       <w:r>
         <w:rPr>
           <w:rFonts w:ascii="Century Gothic" w:hAnsi="Century Gothic"/>
+          <w:b/>
+          <w:bCs/>
           <w:color w:val="404040" w:themeColor="text1" w:themeTint="BF"/>
         </w:rPr>
         <w:t>Purok-</w:t>
@@ -1455,6 +1457,8 @@
       <w:r>
         <w:rPr>
           <w:rFonts w:ascii="Century Gothic" w:hAnsi="Century Gothic"/>
+          <w:b/>
+          <w:bCs/>
           <w:color w:val="404040" w:themeColor="text1" w:themeTint="BF"/>
         </w:rPr>
         <w:t>4</w:t>
@@ -1462,6 +1466,8 @@
       <w:r>
         <w:rPr>
           <w:rFonts w:ascii="Century Gothic" w:hAnsi="Century Gothic"/>
+          <w:b/>
+          <w:bCs/>
           <w:color w:val="404040" w:themeColor="text1" w:themeTint="BF"/>
         </w:rPr>
         <w:t xml:space="preserve">, Barangay Sto. </w:t>
@@ -1469,6 +1475,8 @@
       <w:r>
         <w:rPr>
           <w:rFonts w:ascii="Century Gothic" w:hAnsi="Century Gothic"/>
+          <w:b/>
+          <w:bCs/>
           <w:color w:val="404040" w:themeColor="text1" w:themeTint="BF"/>
         </w:rPr>
         <w:t>Rosario, Magallanes,</w:t>
@@ -1476,13 +1484,17 @@
       <w:r>
         <w:rPr>
           <w:rFonts w:ascii="Century Gothic" w:hAnsi="Century Gothic"/>
-          <w:color w:val="404040" w:themeColor="text1" w:themeTint="BF"/>
-        </w:rPr>
-        <w:t xml:space="preserve"> </w:t>
-      </w:r>
-      <w:r>
-        <w:rPr>
-          <w:rFonts w:ascii="Century Gothic" w:hAnsi="Century Gothic"/>
+          <w:b/>
+          <w:bCs/>
+          <w:color w:val="404040" w:themeColor="text1" w:themeTint="BF"/>
+        </w:rPr>
+        <w:t xml:space="preserve"> </w:t>
+      </w:r>
+      <w:r>
+        <w:rPr>
+          <w:rFonts w:ascii="Century Gothic" w:hAnsi="Century Gothic"/>
+          <w:b/>
+          <w:bCs/>
           <w:color w:val="404040" w:themeColor="text1" w:themeTint="BF"/>
         </w:rPr>
         <w:t>Agusan del Norte</w:t>
@@ -2040,12 +2052,23 @@
           <w:rFonts w:ascii="Century Gothic" w:hAnsi="Century Gothic"/>
           <w:color w:val="404040" w:themeColor="text1" w:themeTint="BF"/>
         </w:rPr>
-        <w:t>this ${</w:t>
+        <w:t xml:space="preserve">this </w:t>
+      </w:r>
+      <w:r>
+        <w:rPr>
+          <w:rFonts w:ascii="Century Gothic" w:hAnsi="Century Gothic"/>
+          <w:b/>
+          <w:bCs/>
+          <w:color w:val="404040" w:themeColor="text1" w:themeTint="BF"/>
+        </w:rPr>
+        <w:t>${</w:t>
       </w:r>
       <w:proofErr w:type="spellStart"/>
       <w:r>
         <w:rPr>
           <w:rFonts w:ascii="Century Gothic" w:hAnsi="Century Gothic"/>
+          <w:b/>
+          <w:bCs/>
           <w:color w:val="404040" w:themeColor="text1" w:themeTint="BF"/>
         </w:rPr>
         <w:t>day_ord</w:t>
@@ -2054,16 +2077,66 @@
       <w:r>
         <w:rPr>
           <w:rFonts w:ascii="Century Gothic" w:hAnsi="Century Gothic"/>
-          <w:color w:val="404040" w:themeColor="text1" w:themeTint="BF"/>
-        </w:rPr>
-        <w:t xml:space="preserve">} day of ${month}, ${year} </w:t>
-      </w:r>
-      <w:r>
-        <w:rPr>
-          <w:rFonts w:ascii="Century Gothic" w:hAnsi="Century Gothic"/>
-          <w:color w:val="404040" w:themeColor="text1" w:themeTint="BF"/>
-        </w:rPr>
-        <w:t>at the O</w:t>
+          <w:b/>
+          <w:bCs/>
+          <w:color w:val="404040" w:themeColor="text1" w:themeTint="BF"/>
+        </w:rPr>
+        <w:t>} day of</w:t>
+      </w:r>
+      <w:r>
+        <w:rPr>
+          <w:rFonts w:ascii="Century Gothic" w:hAnsi="Century Gothic"/>
+          <w:color w:val="404040" w:themeColor="text1" w:themeTint="BF"/>
+        </w:rPr>
+        <w:t xml:space="preserve"> </w:t>
+      </w:r>
+      <w:r>
+        <w:rPr>
+          <w:rFonts w:ascii="Century Gothic" w:hAnsi="Century Gothic"/>
+          <w:b/>
+          <w:bCs/>
+          <w:color w:val="404040" w:themeColor="text1" w:themeTint="BF"/>
+        </w:rPr>
+        <w:t>${month}, ${</w:t>
+      </w:r>
+      <w:proofErr w:type="gramStart"/>
+      <w:r>
+        <w:rPr>
+          <w:rFonts w:ascii="Century Gothic" w:hAnsi="Century Gothic"/>
+          <w:b/>
+          <w:bCs/>
+          <w:color w:val="404040" w:themeColor="text1" w:themeTint="BF"/>
+        </w:rPr>
+        <w:t>year}</w:t>
+      </w:r>
+      <w:r>
+        <w:rPr>
+          <w:rFonts w:ascii="Century Gothic" w:hAnsi="Century Gothic"/>
+          <w:color w:val="404040" w:themeColor="text1" w:themeTint="BF"/>
+        </w:rPr>
+        <w:t xml:space="preserve"> </w:t>
+      </w:r>
+      <w:r>
+        <w:rPr>
+          <w:rFonts w:ascii="Century Gothic" w:hAnsi="Century Gothic"/>
+          <w:color w:val="404040" w:themeColor="text1" w:themeTint="BF"/>
+        </w:rPr>
+        <w:t xml:space="preserve"> </w:t>
+      </w:r>
+      <w:r>
+        <w:rPr>
+          <w:rFonts w:ascii="Century Gothic" w:hAnsi="Century Gothic"/>
+          <w:color w:val="404040" w:themeColor="text1" w:themeTint="BF"/>
+        </w:rPr>
+        <w:t>at</w:t>
+      </w:r>
+      <w:proofErr w:type="gramEnd"/>
+      <w:r>
+        <w:rPr>
+          <w:rFonts w:ascii="Century Gothic" w:hAnsi="Century Gothic"/>
+          <w:color w:val="404040" w:themeColor="text1" w:themeTint="BF"/>
+        </w:rPr>
+        <w:t xml:space="preserve"> the O</w:t>
       </w:r>
       <w:r>
         <w:rPr>

</xml_diff>

<commit_message>
added e swig for hon margie brgy clearance template
</commit_message>
<xml_diff>
--- a/services-system/resources/views/certificates/templates/brgy_clearance.docx
+++ b/services-system/resources/views/certificates/templates/brgy_clearance.docx
@@ -838,63 +838,11 @@
     </w:p>
     <w:p>
       <w:pPr>
-        <w:rPr>
+        <w:spacing w:line="276" w:lineRule="auto"/>
+        <w:rPr>
+          <w:rFonts w:ascii="Century Gothic" w:hAnsi="Century Gothic"/>
           <w:b/>
           <w:color w:val="404040" w:themeColor="text1" w:themeTint="BF"/>
-          <w:sz w:val="20"/>
-          <w:szCs w:val="20"/>
-        </w:rPr>
-      </w:pPr>
-    </w:p>
-    <w:p>
-      <w:pPr>
-        <w:rPr>
-          <w:b/>
-          <w:color w:val="404040" w:themeColor="text1" w:themeTint="BF"/>
-          <w:sz w:val="22"/>
-          <w:szCs w:val="20"/>
-        </w:rPr>
-      </w:pPr>
-    </w:p>
-    <w:p>
-      <w:pPr>
-        <w:spacing w:line="360" w:lineRule="auto"/>
-        <w:rPr>
-          <w:b/>
-          <w:color w:val="404040" w:themeColor="text1" w:themeTint="BF"/>
-          <w:sz w:val="22"/>
-          <w:szCs w:val="20"/>
-        </w:rPr>
-      </w:pPr>
-    </w:p>
-    <w:p>
-      <w:pPr>
-        <w:rPr>
-          <w:b/>
-          <w:color w:val="404040" w:themeColor="text1" w:themeTint="BF"/>
-          <w:sz w:val="22"/>
-          <w:szCs w:val="20"/>
-        </w:rPr>
-      </w:pPr>
-    </w:p>
-    <w:p>
-      <w:pPr>
-        <w:rPr>
-          <w:b/>
-          <w:color w:val="404040" w:themeColor="text1" w:themeTint="BF"/>
-          <w:sz w:val="22"/>
-          <w:szCs w:val="20"/>
-        </w:rPr>
-      </w:pPr>
-    </w:p>
-    <w:p>
-      <w:pPr>
-        <w:rPr>
-          <w:rFonts w:ascii="Century Gothic" w:hAnsi="Century Gothic"/>
-          <w:b/>
-          <w:color w:val="404040" w:themeColor="text1" w:themeTint="BF"/>
-          <w:sz w:val="14"/>
-          <w:szCs w:val="14"/>
         </w:rPr>
       </w:pPr>
     </w:p>
@@ -907,13 +855,69 @@
           <w:color w:val="404040" w:themeColor="text1" w:themeTint="BF"/>
         </w:rPr>
       </w:pPr>
-      <w:r>
+    </w:p>
+    <w:p>
+      <w:pPr>
+        <w:spacing w:line="276" w:lineRule="auto"/>
         <w:rPr>
           <w:rFonts w:ascii="Century Gothic" w:hAnsi="Century Gothic"/>
           <w:b/>
           <w:color w:val="404040" w:themeColor="text1" w:themeTint="BF"/>
         </w:rPr>
-        <w:t>TO WHOM IT MAY CONCERN:</w:t>
+      </w:pPr>
+    </w:p>
+    <w:p>
+      <w:pPr>
+        <w:spacing w:line="276" w:lineRule="auto"/>
+        <w:rPr>
+          <w:rFonts w:ascii="Century Gothic" w:hAnsi="Century Gothic"/>
+          <w:b/>
+          <w:color w:val="404040" w:themeColor="text1" w:themeTint="BF"/>
+        </w:rPr>
+      </w:pPr>
+    </w:p>
+    <w:p>
+      <w:pPr>
+        <w:spacing w:line="276" w:lineRule="auto"/>
+        <w:rPr>
+          <w:rFonts w:ascii="Century Gothic" w:hAnsi="Century Gothic"/>
+          <w:b/>
+          <w:color w:val="404040" w:themeColor="text1" w:themeTint="BF"/>
+        </w:rPr>
+      </w:pPr>
+    </w:p>
+    <w:p>
+      <w:pPr>
+        <w:spacing w:line="276" w:lineRule="auto"/>
+        <w:rPr>
+          <w:rFonts w:ascii="Century Gothic" w:hAnsi="Century Gothic"/>
+          <w:b/>
+          <w:color w:val="404040" w:themeColor="text1" w:themeTint="BF"/>
+        </w:rPr>
+      </w:pPr>
+      <w:r>
+        <w:rPr>
+          <w:rFonts w:ascii="Century Gothic" w:hAnsi="Century Gothic"/>
+          <w:b/>
+          <w:color w:val="404040" w:themeColor="text1" w:themeTint="BF"/>
+        </w:rPr>
+        <w:t>TO</w:t>
+      </w:r>
+      <w:r>
+        <w:rPr>
+          <w:rFonts w:ascii="Century Gothic" w:hAnsi="Century Gothic"/>
+          <w:b/>
+          <w:color w:val="404040" w:themeColor="text1" w:themeTint="BF"/>
+        </w:rPr>
+        <w:t xml:space="preserve"> </w:t>
+      </w:r>
+      <w:r>
+        <w:rPr>
+          <w:rFonts w:ascii="Century Gothic" w:hAnsi="Century Gothic"/>
+          <w:b/>
+          <w:color w:val="404040" w:themeColor="text1" w:themeTint="BF"/>
+        </w:rPr>
+        <w:t>WHOM IT MAY CONCERN:</w:t>
       </w:r>
     </w:p>
     <w:p>
@@ -2097,46 +2101,21 @@
           <w:bCs/>
           <w:color w:val="404040" w:themeColor="text1" w:themeTint="BF"/>
         </w:rPr>
-        <w:t>${month}, ${</w:t>
-      </w:r>
-      <w:proofErr w:type="gramStart"/>
-      <w:r>
-        <w:rPr>
-          <w:rFonts w:ascii="Century Gothic" w:hAnsi="Century Gothic"/>
-          <w:b/>
-          <w:bCs/>
-          <w:color w:val="404040" w:themeColor="text1" w:themeTint="BF"/>
-        </w:rPr>
-        <w:t>year}</w:t>
-      </w:r>
-      <w:r>
-        <w:rPr>
-          <w:rFonts w:ascii="Century Gothic" w:hAnsi="Century Gothic"/>
-          <w:color w:val="404040" w:themeColor="text1" w:themeTint="BF"/>
-        </w:rPr>
-        <w:t xml:space="preserve"> </w:t>
-      </w:r>
-      <w:r>
-        <w:rPr>
-          <w:rFonts w:ascii="Century Gothic" w:hAnsi="Century Gothic"/>
-          <w:color w:val="404040" w:themeColor="text1" w:themeTint="BF"/>
-        </w:rPr>
-        <w:t xml:space="preserve"> </w:t>
-      </w:r>
-      <w:r>
-        <w:rPr>
-          <w:rFonts w:ascii="Century Gothic" w:hAnsi="Century Gothic"/>
-          <w:color w:val="404040" w:themeColor="text1" w:themeTint="BF"/>
-        </w:rPr>
-        <w:t>at</w:t>
-      </w:r>
-      <w:proofErr w:type="gramEnd"/>
-      <w:r>
-        <w:rPr>
-          <w:rFonts w:ascii="Century Gothic" w:hAnsi="Century Gothic"/>
-          <w:color w:val="404040" w:themeColor="text1" w:themeTint="BF"/>
-        </w:rPr>
-        <w:t xml:space="preserve"> the O</w:t>
+        <w:t>${month}, ${year}</w:t>
+      </w:r>
+      <w:r>
+        <w:rPr>
+          <w:rFonts w:ascii="Century Gothic" w:hAnsi="Century Gothic"/>
+          <w:color w:val="404040" w:themeColor="text1" w:themeTint="BF"/>
+        </w:rPr>
+        <w:t xml:space="preserve"> </w:t>
+      </w:r>
+      <w:r>
+        <w:rPr>
+          <w:rFonts w:ascii="Century Gothic" w:hAnsi="Century Gothic"/>
+          <w:color w:val="404040" w:themeColor="text1" w:themeTint="BF"/>
+        </w:rPr>
+        <w:t>at the O</w:t>
       </w:r>
       <w:r>
         <w:rPr>
@@ -2201,82 +2180,6 @@
         </w:rPr>
         <w:t xml:space="preserve"> Agusan del Norte. </w:t>
       </w:r>
-    </w:p>
-    <w:p>
-      <w:pPr>
-        <w:jc w:val="both"/>
-        <w:rPr>
-          <w:rFonts w:ascii="Century Gothic" w:hAnsi="Century Gothic"/>
-          <w:bCs/>
-          <w:color w:val="404040" w:themeColor="text1" w:themeTint="BF"/>
-          <w:sz w:val="14"/>
-          <w:szCs w:val="14"/>
-        </w:rPr>
-      </w:pPr>
-    </w:p>
-    <w:p>
-      <w:pPr>
-        <w:jc w:val="both"/>
-        <w:rPr>
-          <w:rFonts w:ascii="Century Gothic" w:hAnsi="Century Gothic"/>
-          <w:bCs/>
-          <w:color w:val="404040" w:themeColor="text1" w:themeTint="BF"/>
-          <w:sz w:val="20"/>
-          <w:szCs w:val="20"/>
-        </w:rPr>
-      </w:pPr>
-      <w:r>
-        <w:rPr>
-          <w:rFonts w:ascii="Century Gothic" w:hAnsi="Century Gothic"/>
-          <w:bCs/>
-          <w:color w:val="404040" w:themeColor="text1" w:themeTint="BF"/>
-          <w:sz w:val="20"/>
-          <w:szCs w:val="20"/>
-        </w:rPr>
-        <w:tab/>
-      </w:r>
-      <w:r>
-        <w:rPr>
-          <w:rFonts w:ascii="Century Gothic" w:hAnsi="Century Gothic"/>
-          <w:bCs/>
-          <w:color w:val="404040" w:themeColor="text1" w:themeTint="BF"/>
-          <w:sz w:val="20"/>
-          <w:szCs w:val="20"/>
-        </w:rPr>
-        <w:tab/>
-      </w:r>
-      <w:r>
-        <w:rPr>
-          <w:rFonts w:ascii="Century Gothic" w:hAnsi="Century Gothic"/>
-          <w:bCs/>
-          <w:color w:val="404040" w:themeColor="text1" w:themeTint="BF"/>
-          <w:sz w:val="20"/>
-          <w:szCs w:val="20"/>
-        </w:rPr>
-        <w:tab/>
-      </w:r>
-      <w:r>
-        <w:rPr>
-          <w:rFonts w:ascii="Century Gothic" w:hAnsi="Century Gothic"/>
-          <w:bCs/>
-          <w:color w:val="404040" w:themeColor="text1" w:themeTint="BF"/>
-          <w:sz w:val="20"/>
-          <w:szCs w:val="20"/>
-        </w:rPr>
-        <w:tab/>
-      </w:r>
-    </w:p>
-    <w:p>
-      <w:pPr>
-        <w:jc w:val="both"/>
-        <w:rPr>
-          <w:rFonts w:ascii="Century Gothic" w:hAnsi="Century Gothic"/>
-          <w:bCs/>
-          <w:color w:val="404040" w:themeColor="text1" w:themeTint="BF"/>
-          <w:sz w:val="8"/>
-          <w:szCs w:val="8"/>
-        </w:rPr>
-      </w:pPr>
     </w:p>
     <w:p>
       <w:pPr>
@@ -2580,8 +2483,6 @@
         <w:rPr>
           <w:rFonts w:ascii="Century Gothic" w:hAnsi="Century Gothic"/>
           <w:color w:val="404040" w:themeColor="text1" w:themeTint="BF"/>
-          <w:sz w:val="18"/>
-          <w:szCs w:val="18"/>
         </w:rPr>
       </w:pPr>
       <w:r>
@@ -2691,8 +2592,8 @@
         <w:rPr>
           <w:rFonts w:ascii="Century Gothic" w:hAnsi="Century Gothic"/>
           <w:color w:val="404040" w:themeColor="text1" w:themeTint="BF"/>
-          <w:sz w:val="20"/>
-          <w:szCs w:val="20"/>
+          <w:sz w:val="18"/>
+          <w:szCs w:val="18"/>
         </w:rPr>
       </w:pPr>
     </w:p>
@@ -2700,13 +2601,68 @@
       <w:pPr>
         <w:ind w:left="6480"/>
         <w:jc w:val="both"/>
-        <w:rPr>
-          <w:rFonts w:ascii="Century Gothic" w:hAnsi="Century Gothic"/>
-          <w:color w:val="404040" w:themeColor="text1" w:themeTint="BF"/>
-          <w:sz w:val="20"/>
-          <w:szCs w:val="20"/>
-        </w:rPr>
       </w:pPr>
+      <w:r>
+        <w:rPr>
+          <w:noProof/>
+        </w:rPr>
+        <w:drawing>
+          <wp:anchor distT="0" distB="0" distL="114300" distR="114300" simplePos="0" relativeHeight="251671552" behindDoc="1" locked="0" layoutInCell="1" allowOverlap="1" wp14:anchorId="706DC757" wp14:editId="045A6E6E">
+            <wp:simplePos x="0" y="0"/>
+            <wp:positionH relativeFrom="column">
+              <wp:posOffset>4569460</wp:posOffset>
+            </wp:positionH>
+            <wp:positionV relativeFrom="paragraph">
+              <wp:posOffset>13335</wp:posOffset>
+            </wp:positionV>
+            <wp:extent cx="1276350" cy="494309"/>
+            <wp:effectExtent l="0" t="0" r="0" b="1270"/>
+            <wp:wrapNone/>
+            <wp:docPr id="287317756" name="Picture 4"/>
+            <wp:cNvGraphicFramePr>
+              <a:graphicFrameLocks xmlns:a="http://schemas.openxmlformats.org/drawingml/2006/main" noChangeAspect="1"/>
+            </wp:cNvGraphicFramePr>
+            <a:graphic xmlns:a="http://schemas.openxmlformats.org/drawingml/2006/main">
+              <a:graphicData uri="http://schemas.openxmlformats.org/drawingml/2006/picture">
+                <pic:pic xmlns:pic="http://schemas.openxmlformats.org/drawingml/2006/picture">
+                  <pic:nvPicPr>
+                    <pic:cNvPr id="0" name="Picture 6"/>
+                    <pic:cNvPicPr>
+                      <a:picLocks noChangeAspect="1" noChangeArrowheads="1"/>
+                    </pic:cNvPicPr>
+                  </pic:nvPicPr>
+                  <pic:blipFill>
+                    <a:blip r:embed="rId12">
+                      <a:extLst>
+                        <a:ext uri="{28A0092B-C50C-407E-A947-70E740481C1C}">
+                          <a14:useLocalDpi xmlns:a14="http://schemas.microsoft.com/office/drawing/2010/main" val="0"/>
+                        </a:ext>
+                      </a:extLst>
+                    </a:blip>
+                    <a:srcRect/>
+                    <a:stretch>
+                      <a:fillRect/>
+                    </a:stretch>
+                  </pic:blipFill>
+                  <pic:spPr bwMode="auto">
+                    <a:xfrm>
+                      <a:off x="0" y="0"/>
+                      <a:ext cx="1276350" cy="494309"/>
+                    </a:xfrm>
+                    <a:prstGeom prst="rect">
+                      <a:avLst/>
+                    </a:prstGeom>
+                    <a:noFill/>
+                    <a:ln>
+                      <a:noFill/>
+                    </a:ln>
+                  </pic:spPr>
+                </pic:pic>
+              </a:graphicData>
+            </a:graphic>
+          </wp:anchor>
+        </w:drawing>
+      </w:r>
     </w:p>
     <w:p>
       <w:pPr>
@@ -2722,15 +2678,7 @@
         </w:rPr>
       </w:pPr>
       <w:r>
-        <w:rPr>
-          <w:rFonts w:ascii="Century Gothic" w:hAnsi="Century Gothic"/>
-          <w:b/>
-          <w:bCs/>
-          <w:color w:val="404040" w:themeColor="text1" w:themeTint="BF"/>
-          <w:sz w:val="22"/>
-          <w:szCs w:val="22"/>
-        </w:rPr>
-        <w:t xml:space="preserve">     </w:t>
+        <w:br/>
       </w:r>
       <w:r>
         <w:rPr>
@@ -4161,7 +4109,7 @@
         </w:rPr>
         <w:t xml:space="preserve"> </w:t>
       </w:r>
-      <w:hyperlink r:id="rId12" w:history="1"/>
+      <w:hyperlink r:id="rId13" w:history="1"/>
     </w:p>
     <w:sectPr>
       <w:pgSz w:w="12240" w:h="15840" w:code="1"/>

</xml_diff>